<commit_message>
made changes for cybersecurity paths and updated the resume/about/home
</commit_message>
<xml_diff>
--- a/public/resume/Rowen_Hutchins_Resume.docx
+++ b/public/resume/Rowen_Hutchins_Resume.docx
@@ -47,31 +47,7 @@
           <w:sz w:val="20"/>
           <w:szCs w:val="20"/>
         </w:rPr>
-        <w:t xml:space="preserve">Lakeland, FL  |  </w:t>
-      </w:r>
-      <w:r>
-        <w:rPr>
-          <w:color w:val="555555"/>
-          <w:sz w:val="20"/>
-          <w:szCs w:val="20"/>
-        </w:rPr>
-        <w:t xml:space="preserve">404-578-7769</w:t>
-      </w:r>
-      <w:r>
-        <w:rPr>
-          <w:color w:val="555555"/>
-          <w:sz w:val="20"/>
-          <w:szCs w:val="20"/>
-        </w:rPr>
-        <w:t xml:space="preserve">  |  </w:t>
-      </w:r>
-      <w:r>
-        <w:rPr>
-          <w:color w:val="555555"/>
-          <w:sz w:val="20"/>
-          <w:szCs w:val="20"/>
-        </w:rPr>
-        <w:t xml:space="preserve">rowen.hutchins@gmail.com</w:t>
+        <w:t xml:space="preserve">Lakeland, FL  |  404-578-7769  |  rowen.hutchins@gmail.com</w:t>
       </w:r>
     </w:p>
     <w:p>
@@ -85,23 +61,7 @@
           <w:sz w:val="20"/>
           <w:szCs w:val="20"/>
         </w:rPr>
-        <w:t xml:space="preserve">rowenhutchins.com</w:t>
-      </w:r>
-      <w:r>
-        <w:rPr>
-          <w:color w:val="555555"/>
-          <w:sz w:val="20"/>
-          <w:szCs w:val="20"/>
-        </w:rPr>
-        <w:t xml:space="preserve">  |  </w:t>
-      </w:r>
-      <w:r>
-        <w:rPr>
-          <w:color w:val="555555"/>
-          <w:sz w:val="20"/>
-          <w:szCs w:val="20"/>
-        </w:rPr>
-        <w:t xml:space="preserve">github.com/rowenhutchins-cmd</w:t>
+        <w:t xml:space="preserve">rowenhutchins.com  |  github.com/rowenhutchins-cmd</w:t>
       </w:r>
     </w:p>
     <w:p>
@@ -198,7 +158,7 @@
           <w:sz w:val="20"/>
           <w:szCs w:val="20"/>
         </w:rPr>
-        <w:t xml:space="preserve">Node.js, Express (in progress)</w:t>
+        <w:t xml:space="preserve">Python (in progress)</w:t>
       </w:r>
     </w:p>
     <w:p>
@@ -245,6 +205,52 @@
           <w:szCs w:val="20"/>
         </w:rPr>
         <w:t xml:space="preserve">Git, GitHub</w:t>
+      </w:r>
+    </w:p>
+    <w:p>
+      <w:pPr>
+        <w:spacing w:after="40"/>
+      </w:pPr>
+      <w:r>
+        <w:rPr>
+          <w:b/>
+          <w:bCs/>
+          <w:color w:val="333333"/>
+          <w:sz w:val="20"/>
+          <w:szCs w:val="20"/>
+        </w:rPr>
+        <w:t xml:space="preserve">Cybersecurity: </w:t>
+      </w:r>
+      <w:r>
+        <w:rPr>
+          <w:color w:val="333333"/>
+          <w:sz w:val="20"/>
+          <w:szCs w:val="20"/>
+        </w:rPr>
+        <w:t xml:space="preserve">Linux system administration, firewall configuration</w:t>
+      </w:r>
+    </w:p>
+    <w:p>
+      <w:pPr>
+        <w:spacing w:after="40"/>
+      </w:pPr>
+      <w:r>
+        <w:rPr>
+          <w:b/>
+          <w:bCs/>
+          <w:color w:val="333333"/>
+          <w:sz w:val="20"/>
+          <w:szCs w:val="20"/>
+        </w:rPr>
+        <w:t xml:space="preserve">Certifications (In Progress): </w:t>
+      </w:r>
+      <w:r>
+        <w:rPr>
+          <w:color w:val="333333"/>
+          <w:sz w:val="20"/>
+          <w:szCs w:val="20"/>
+        </w:rPr>
+        <w:t xml:space="preserve">CompTIA A+, Network+, Security+</w:t>
       </w:r>
     </w:p>
     <w:p>
@@ -609,7 +615,7 @@
     </w:p>
     <w:p>
       <w:pPr>
-        <w:spacing w:after="40"/>
+        <w:spacing w:after="100"/>
       </w:pPr>
       <w:r>
         <w:rPr>
@@ -618,6 +624,34 @@
           <w:szCs w:val="20"/>
         </w:rPr>
         <w:t xml:space="preserve">Embry-Riddle Aeronautical University  |  Expected Graduation: 2027</w:t>
+      </w:r>
+    </w:p>
+    <w:p>
+      <w:pPr>
+        <w:spacing w:after="20"/>
+      </w:pPr>
+      <w:r>
+        <w:rPr>
+          <w:b/>
+          <w:bCs/>
+          <w:color w:val="333333"/>
+          <w:sz w:val="20"/>
+          <w:szCs w:val="20"/>
+        </w:rPr>
+        <w:t xml:space="preserve">Cybersecurity Track (In Progress)</w:t>
+      </w:r>
+    </w:p>
+    <w:p>
+      <w:pPr>
+        <w:spacing w:after="40"/>
+      </w:pPr>
+      <w:r>
+        <w:rPr>
+          <w:color w:val="555555"/>
+          <w:sz w:val="20"/>
+          <w:szCs w:val="20"/>
+        </w:rPr>
+        <w:t xml:space="preserve">Central Texas College  |  CompTIA A+, Network+, Security+; Linux &amp; Firewall Configuration coursework</w:t>
       </w:r>
     </w:p>
     <w:sectPr>

</xml_diff>